<commit_message>
Тема 7, Material Design
</commit_message>
<xml_diff>
--- a/Отчёт по УП 05.01 Слизов.docx
+++ b/Отчёт по УП 05.01 Слизов.docx
@@ -1083,11 +1083,7 @@
             <w:rPr>
               <w:rFonts w:eastAsiaTheme="minorEastAsia"/>
               <w:noProof/>
-              <w:kern w:val="2"/>
-              <w:sz w:val="24"/>
-              <w:szCs w:val="24"/>
               <w:lang w:eastAsia="ru-RU"/>
-              <w14:ligatures w14:val="standardContextual"/>
             </w:rPr>
           </w:pPr>
           <w:r>
@@ -1108,7 +1104,7 @@
             </w:rPr>
             <w:fldChar w:fldCharType="separate"/>
           </w:r>
-          <w:hyperlink w:anchor="_Toc195102316" w:history="1">
+          <w:hyperlink w:anchor="_Toc195538310" w:history="1">
             <w:r>
               <w:rPr>
                 <w:rStyle w:val="a7"/>
@@ -1136,7 +1132,7 @@
                 <w:noProof/>
                 <w:webHidden/>
               </w:rPr>
-              <w:instrText xml:space="preserve"> PAGEREF _Toc195102316 \h </w:instrText>
+              <w:instrText xml:space="preserve"> PAGEREF _Toc195538310 \h </w:instrText>
             </w:r>
             <w:r>
               <w:rPr>
@@ -1176,14 +1172,10 @@
             <w:rPr>
               <w:rFonts w:eastAsiaTheme="minorEastAsia"/>
               <w:noProof/>
-              <w:kern w:val="2"/>
-              <w:sz w:val="24"/>
-              <w:szCs w:val="24"/>
               <w:lang w:eastAsia="ru-RU"/>
-              <w14:ligatures w14:val="standardContextual"/>
             </w:rPr>
           </w:pPr>
-          <w:hyperlink w:anchor="_Toc195102317" w:history="1">
+          <w:hyperlink w:anchor="_Toc195538311" w:history="1">
             <w:r>
               <w:rPr>
                 <w:rStyle w:val="a7"/>
@@ -1211,7 +1203,7 @@
                 <w:noProof/>
                 <w:webHidden/>
               </w:rPr>
-              <w:instrText xml:space="preserve"> PAGEREF _Toc195102317 \h </w:instrText>
+              <w:instrText xml:space="preserve"> PAGEREF _Toc195538311 \h </w:instrText>
             </w:r>
             <w:r>
               <w:rPr>
@@ -1251,14 +1243,10 @@
             <w:rPr>
               <w:rFonts w:eastAsiaTheme="minorEastAsia"/>
               <w:noProof/>
-              <w:kern w:val="2"/>
-              <w:sz w:val="24"/>
-              <w:szCs w:val="24"/>
               <w:lang w:eastAsia="ru-RU"/>
-              <w14:ligatures w14:val="standardContextual"/>
             </w:rPr>
           </w:pPr>
-          <w:hyperlink w:anchor="_Toc195102318" w:history="1">
+          <w:hyperlink w:anchor="_Toc195538312" w:history="1">
             <w:r>
               <w:rPr>
                 <w:rStyle w:val="a7"/>
@@ -1286,7 +1274,7 @@
                 <w:noProof/>
                 <w:webHidden/>
               </w:rPr>
-              <w:instrText xml:space="preserve"> PAGEREF _Toc195102318 \h </w:instrText>
+              <w:instrText xml:space="preserve"> PAGEREF _Toc195538312 \h </w:instrText>
             </w:r>
             <w:r>
               <w:rPr>
@@ -1326,14 +1314,10 @@
             <w:rPr>
               <w:rFonts w:eastAsiaTheme="minorEastAsia"/>
               <w:noProof/>
-              <w:kern w:val="2"/>
-              <w:sz w:val="24"/>
-              <w:szCs w:val="24"/>
               <w:lang w:eastAsia="ru-RU"/>
-              <w14:ligatures w14:val="standardContextual"/>
             </w:rPr>
           </w:pPr>
-          <w:hyperlink w:anchor="_Toc195102319" w:history="1">
+          <w:hyperlink w:anchor="_Toc195538313" w:history="1">
             <w:r>
               <w:rPr>
                 <w:rStyle w:val="a7"/>
@@ -1361,7 +1345,7 @@
                 <w:noProof/>
                 <w:webHidden/>
               </w:rPr>
-              <w:instrText xml:space="preserve"> PAGEREF _Toc195102319 \h </w:instrText>
+              <w:instrText xml:space="preserve"> PAGEREF _Toc195538313 \h </w:instrText>
             </w:r>
             <w:r>
               <w:rPr>
@@ -1401,14 +1385,10 @@
             <w:rPr>
               <w:rFonts w:eastAsiaTheme="minorEastAsia"/>
               <w:noProof/>
-              <w:kern w:val="2"/>
-              <w:sz w:val="24"/>
-              <w:szCs w:val="24"/>
               <w:lang w:eastAsia="ru-RU"/>
-              <w14:ligatures w14:val="standardContextual"/>
             </w:rPr>
           </w:pPr>
-          <w:hyperlink w:anchor="_Toc195102320" w:history="1">
+          <w:hyperlink w:anchor="_Toc195538314" w:history="1">
             <w:r>
               <w:rPr>
                 <w:rStyle w:val="a7"/>
@@ -1436,7 +1416,7 @@
                 <w:noProof/>
                 <w:webHidden/>
               </w:rPr>
-              <w:instrText xml:space="preserve"> PAGEREF _Toc195102320 \h </w:instrText>
+              <w:instrText xml:space="preserve"> PAGEREF _Toc195538314 \h </w:instrText>
             </w:r>
             <w:r>
               <w:rPr>
@@ -1476,14 +1456,10 @@
             <w:rPr>
               <w:rFonts w:eastAsiaTheme="minorEastAsia"/>
               <w:noProof/>
-              <w:kern w:val="2"/>
-              <w:sz w:val="24"/>
-              <w:szCs w:val="24"/>
               <w:lang w:eastAsia="ru-RU"/>
-              <w14:ligatures w14:val="standardContextual"/>
             </w:rPr>
           </w:pPr>
-          <w:hyperlink w:anchor="_Toc195102321" w:history="1">
+          <w:hyperlink w:anchor="_Toc195538315" w:history="1">
             <w:r>
               <w:rPr>
                 <w:rStyle w:val="a7"/>
@@ -1511,7 +1487,7 @@
                 <w:noProof/>
                 <w:webHidden/>
               </w:rPr>
-              <w:instrText xml:space="preserve"> PAGEREF _Toc195102321 \h </w:instrText>
+              <w:instrText xml:space="preserve"> PAGEREF _Toc195538315 \h </w:instrText>
             </w:r>
             <w:r>
               <w:rPr>
@@ -1551,14 +1527,10 @@
             <w:rPr>
               <w:rFonts w:eastAsiaTheme="minorEastAsia"/>
               <w:noProof/>
-              <w:kern w:val="2"/>
-              <w:sz w:val="24"/>
-              <w:szCs w:val="24"/>
               <w:lang w:eastAsia="ru-RU"/>
-              <w14:ligatures w14:val="standardContextual"/>
             </w:rPr>
           </w:pPr>
-          <w:hyperlink w:anchor="_Toc195102322" w:history="1">
+          <w:hyperlink w:anchor="_Toc195538316" w:history="1">
             <w:r>
               <w:rPr>
                 <w:rStyle w:val="a7"/>
@@ -1595,7 +1567,7 @@
                 <w:noProof/>
                 <w:webHidden/>
               </w:rPr>
-              <w:instrText xml:space="preserve"> PAGEREF _Toc195102322 \h </w:instrText>
+              <w:instrText xml:space="preserve"> PAGEREF _Toc195538316 \h </w:instrText>
             </w:r>
             <w:r>
               <w:rPr>
@@ -1615,7 +1587,7 @@
                 <w:noProof/>
                 <w:webHidden/>
               </w:rPr>
-              <w:t>14</w:t>
+              <w:t>16</w:t>
             </w:r>
             <w:r>
               <w:rPr>
@@ -1635,14 +1607,10 @@
             <w:rPr>
               <w:rFonts w:eastAsiaTheme="minorEastAsia"/>
               <w:noProof/>
-              <w:kern w:val="2"/>
-              <w:sz w:val="24"/>
-              <w:szCs w:val="24"/>
               <w:lang w:eastAsia="ru-RU"/>
-              <w14:ligatures w14:val="standardContextual"/>
             </w:rPr>
           </w:pPr>
-          <w:hyperlink w:anchor="_Toc195102323" w:history="1">
+          <w:hyperlink w:anchor="_Toc195538317" w:history="1">
             <w:r>
               <w:rPr>
                 <w:rStyle w:val="a7"/>
@@ -1670,7 +1638,7 @@
                 <w:noProof/>
                 <w:webHidden/>
               </w:rPr>
-              <w:instrText xml:space="preserve"> PAGEREF _Toc195102323 \h </w:instrText>
+              <w:instrText xml:space="preserve"> PAGEREF _Toc195538317 \h </w:instrText>
             </w:r>
             <w:r>
               <w:rPr>
@@ -1690,7 +1658,7 @@
                 <w:noProof/>
                 <w:webHidden/>
               </w:rPr>
-              <w:t>15</w:t>
+              <w:t>18</w:t>
             </w:r>
             <w:r>
               <w:rPr>
@@ -1710,14 +1678,10 @@
             <w:rPr>
               <w:rFonts w:eastAsiaTheme="minorEastAsia"/>
               <w:noProof/>
-              <w:kern w:val="2"/>
-              <w:sz w:val="24"/>
-              <w:szCs w:val="24"/>
               <w:lang w:eastAsia="ru-RU"/>
-              <w14:ligatures w14:val="standardContextual"/>
             </w:rPr>
           </w:pPr>
-          <w:hyperlink w:anchor="_Toc195102324" w:history="1">
+          <w:hyperlink w:anchor="_Toc195538318" w:history="1">
             <w:r>
               <w:rPr>
                 <w:rStyle w:val="a7"/>
@@ -1745,7 +1709,7 @@
                 <w:noProof/>
                 <w:webHidden/>
               </w:rPr>
-              <w:instrText xml:space="preserve"> PAGEREF _Toc195102324 \h </w:instrText>
+              <w:instrText xml:space="preserve"> PAGEREF _Toc195538318 \h </w:instrText>
             </w:r>
             <w:r>
               <w:rPr>
@@ -1765,7 +1729,7 @@
                 <w:noProof/>
                 <w:webHidden/>
               </w:rPr>
-              <w:t>16</w:t>
+              <w:t>19</w:t>
             </w:r>
             <w:r>
               <w:rPr>
@@ -1785,14 +1749,10 @@
             <w:rPr>
               <w:rFonts w:eastAsiaTheme="minorEastAsia"/>
               <w:noProof/>
-              <w:kern w:val="2"/>
-              <w:sz w:val="24"/>
-              <w:szCs w:val="24"/>
               <w:lang w:eastAsia="ru-RU"/>
-              <w14:ligatures w14:val="standardContextual"/>
             </w:rPr>
           </w:pPr>
-          <w:hyperlink w:anchor="_Toc195102325" w:history="1">
+          <w:hyperlink w:anchor="_Toc195538319" w:history="1">
             <w:r>
               <w:rPr>
                 <w:rStyle w:val="a7"/>
@@ -1820,7 +1780,7 @@
                 <w:noProof/>
                 <w:webHidden/>
               </w:rPr>
-              <w:instrText xml:space="preserve"> PAGEREF _Toc195102325 \h </w:instrText>
+              <w:instrText xml:space="preserve"> PAGEREF _Toc195538319 \h </w:instrText>
             </w:r>
             <w:r>
               <w:rPr>
@@ -1840,7 +1800,7 @@
                 <w:noProof/>
                 <w:webHidden/>
               </w:rPr>
-              <w:t>17</w:t>
+              <w:t>20</w:t>
             </w:r>
             <w:r>
               <w:rPr>
@@ -1860,14 +1820,10 @@
             <w:rPr>
               <w:rFonts w:eastAsiaTheme="minorEastAsia"/>
               <w:noProof/>
-              <w:kern w:val="2"/>
-              <w:sz w:val="24"/>
-              <w:szCs w:val="24"/>
               <w:lang w:eastAsia="ru-RU"/>
-              <w14:ligatures w14:val="standardContextual"/>
             </w:rPr>
           </w:pPr>
-          <w:hyperlink w:anchor="_Toc195102326" w:history="1">
+          <w:hyperlink w:anchor="_Toc195538320" w:history="1">
             <w:r>
               <w:rPr>
                 <w:rStyle w:val="a7"/>
@@ -1895,7 +1851,7 @@
                 <w:noProof/>
                 <w:webHidden/>
               </w:rPr>
-              <w:instrText xml:space="preserve"> PAGEREF _Toc195102326 \h </w:instrText>
+              <w:instrText xml:space="preserve"> PAGEREF _Toc195538320 \h </w:instrText>
             </w:r>
             <w:r>
               <w:rPr>
@@ -1915,7 +1871,7 @@
                 <w:noProof/>
                 <w:webHidden/>
               </w:rPr>
-              <w:t>18</w:t>
+              <w:t>21</w:t>
             </w:r>
             <w:r>
               <w:rPr>
@@ -1935,14 +1891,10 @@
             <w:rPr>
               <w:rFonts w:eastAsiaTheme="minorEastAsia"/>
               <w:noProof/>
-              <w:kern w:val="2"/>
-              <w:sz w:val="24"/>
-              <w:szCs w:val="24"/>
               <w:lang w:eastAsia="ru-RU"/>
-              <w14:ligatures w14:val="standardContextual"/>
             </w:rPr>
           </w:pPr>
-          <w:hyperlink w:anchor="_Toc195102327" w:history="1">
+          <w:hyperlink w:anchor="_Toc195538321" w:history="1">
             <w:r>
               <w:rPr>
                 <w:rStyle w:val="a7"/>
@@ -1979,7 +1931,7 @@
                 <w:noProof/>
                 <w:webHidden/>
               </w:rPr>
-              <w:instrText xml:space="preserve"> PAGEREF _Toc195102327 \h </w:instrText>
+              <w:instrText xml:space="preserve"> PAGEREF _Toc195538321 \h </w:instrText>
             </w:r>
             <w:r>
               <w:rPr>
@@ -1999,7 +1951,7 @@
                 <w:noProof/>
                 <w:webHidden/>
               </w:rPr>
-              <w:t>19</w:t>
+              <w:t>22</w:t>
             </w:r>
             <w:r>
               <w:rPr>
@@ -2019,14 +1971,10 @@
             <w:rPr>
               <w:rFonts w:eastAsiaTheme="minorEastAsia"/>
               <w:noProof/>
-              <w:kern w:val="2"/>
-              <w:sz w:val="24"/>
-              <w:szCs w:val="24"/>
               <w:lang w:eastAsia="ru-RU"/>
-              <w14:ligatures w14:val="standardContextual"/>
             </w:rPr>
           </w:pPr>
-          <w:hyperlink w:anchor="_Toc195102328" w:history="1">
+          <w:hyperlink w:anchor="_Toc195538322" w:history="1">
             <w:r>
               <w:rPr>
                 <w:rStyle w:val="a7"/>
@@ -2062,7 +2010,7 @@
                 <w:noProof/>
                 <w:webHidden/>
               </w:rPr>
-              <w:instrText xml:space="preserve"> PAGEREF _Toc195102328 \h </w:instrText>
+              <w:instrText xml:space="preserve"> PAGEREF _Toc195538322 \h </w:instrText>
             </w:r>
             <w:r>
               <w:rPr>
@@ -2082,7 +2030,7 @@
                 <w:noProof/>
                 <w:webHidden/>
               </w:rPr>
-              <w:t>20</w:t>
+              <w:t>23</w:t>
             </w:r>
             <w:r>
               <w:rPr>
@@ -2102,14 +2050,10 @@
             <w:rPr>
               <w:rFonts w:eastAsiaTheme="minorEastAsia"/>
               <w:noProof/>
-              <w:kern w:val="2"/>
-              <w:sz w:val="24"/>
-              <w:szCs w:val="24"/>
               <w:lang w:eastAsia="ru-RU"/>
-              <w14:ligatures w14:val="standardContextual"/>
             </w:rPr>
           </w:pPr>
-          <w:hyperlink w:anchor="_Toc195102329" w:history="1">
+          <w:hyperlink w:anchor="_Toc195538323" w:history="1">
             <w:r>
               <w:rPr>
                 <w:rStyle w:val="a7"/>
@@ -2137,7 +2081,7 @@
                 <w:noProof/>
                 <w:webHidden/>
               </w:rPr>
-              <w:instrText xml:space="preserve"> PAGEREF _Toc195102329 \h </w:instrText>
+              <w:instrText xml:space="preserve"> PAGEREF _Toc195538323 \h </w:instrText>
             </w:r>
             <w:r>
               <w:rPr>
@@ -2157,7 +2101,7 @@
                 <w:noProof/>
                 <w:webHidden/>
               </w:rPr>
-              <w:t>21</w:t>
+              <w:t>24</w:t>
             </w:r>
             <w:r>
               <w:rPr>
@@ -2177,14 +2121,10 @@
             <w:rPr>
               <w:rFonts w:eastAsiaTheme="minorEastAsia"/>
               <w:noProof/>
-              <w:kern w:val="2"/>
-              <w:sz w:val="24"/>
-              <w:szCs w:val="24"/>
               <w:lang w:eastAsia="ru-RU"/>
-              <w14:ligatures w14:val="standardContextual"/>
             </w:rPr>
           </w:pPr>
-          <w:hyperlink w:anchor="_Toc195102330" w:history="1">
+          <w:hyperlink w:anchor="_Toc195538324" w:history="1">
             <w:r>
               <w:rPr>
                 <w:rStyle w:val="a7"/>
@@ -2212,7 +2152,7 @@
                 <w:noProof/>
                 <w:webHidden/>
               </w:rPr>
-              <w:instrText xml:space="preserve"> PAGEREF _Toc195102330 \h </w:instrText>
+              <w:instrText xml:space="preserve"> PAGEREF _Toc195538324 \h </w:instrText>
             </w:r>
             <w:r>
               <w:rPr>
@@ -2232,7 +2172,7 @@
                 <w:noProof/>
                 <w:webHidden/>
               </w:rPr>
-              <w:t>22</w:t>
+              <w:t>25</w:t>
             </w:r>
             <w:r>
               <w:rPr>
@@ -2252,14 +2192,10 @@
             <w:rPr>
               <w:rFonts w:eastAsiaTheme="minorEastAsia"/>
               <w:noProof/>
-              <w:kern w:val="2"/>
-              <w:sz w:val="24"/>
-              <w:szCs w:val="24"/>
               <w:lang w:eastAsia="ru-RU"/>
-              <w14:ligatures w14:val="standardContextual"/>
             </w:rPr>
           </w:pPr>
-          <w:hyperlink w:anchor="_Toc195102331" w:history="1">
+          <w:hyperlink w:anchor="_Toc195538325" w:history="1">
             <w:r>
               <w:rPr>
                 <w:rStyle w:val="a7"/>
@@ -2295,7 +2231,7 @@
                 <w:noProof/>
                 <w:webHidden/>
               </w:rPr>
-              <w:instrText xml:space="preserve"> PAGEREF _Toc195102331 \h </w:instrText>
+              <w:instrText xml:space="preserve"> PAGEREF _Toc195538325 \h </w:instrText>
             </w:r>
             <w:r>
               <w:rPr>
@@ -2315,7 +2251,7 @@
                 <w:noProof/>
                 <w:webHidden/>
               </w:rPr>
-              <w:t>23</w:t>
+              <w:t>26</w:t>
             </w:r>
             <w:r>
               <w:rPr>
@@ -2381,7 +2317,7 @@
           <w:color w:val="000000" w:themeColor="text1"/>
         </w:rPr>
       </w:pPr>
-      <w:bookmarkStart w:id="0" w:name="_Toc195102316"/>
+      <w:bookmarkStart w:id="0" w:name="_Toc195538310"/>
       <w:r>
         <w:rPr>
           <w:rFonts w:ascii="Times New Roman" w:hAnsi="Times New Roman" w:cs="Times New Roman"/>
@@ -3343,7 +3279,7 @@
           <w:szCs w:val="28"/>
         </w:rPr>
       </w:pPr>
-      <w:bookmarkStart w:id="1" w:name="_Toc195102317"/>
+      <w:bookmarkStart w:id="1" w:name="_Toc195538311"/>
       <w:r>
         <w:rPr>
           <w:rFonts w:ascii="Times New Roman" w:hAnsi="Times New Roman" w:cs="Times New Roman"/>
@@ -4139,7 +4075,7 @@
           <w:color w:val="000000" w:themeColor="text1"/>
         </w:rPr>
       </w:pPr>
-      <w:bookmarkStart w:id="2" w:name="_Toc195102318"/>
+      <w:bookmarkStart w:id="2" w:name="_Toc195538312"/>
       <w:r>
         <w:rPr>
           <w:rFonts w:ascii="Times New Roman" w:hAnsi="Times New Roman" w:cs="Times New Roman"/>
@@ -4368,7 +4304,7 @@
           <w:color w:val="000000" w:themeColor="text1"/>
         </w:rPr>
       </w:pPr>
-      <w:bookmarkStart w:id="3" w:name="_Toc195102319"/>
+      <w:bookmarkStart w:id="3" w:name="_Toc195538313"/>
       <w:r>
         <w:rPr>
           <w:rFonts w:ascii="Times New Roman" w:hAnsi="Times New Roman" w:cs="Times New Roman"/>
@@ -4418,6 +4354,7 @@
         <w:rPr>
           <w:rFonts w:ascii="Times New Roman" w:hAnsi="Times New Roman" w:cs="Times New Roman"/>
           <w:b/>
+          <w:noProof/>
           <w:color w:val="000000" w:themeColor="text1"/>
           <w:sz w:val="28"/>
           <w:szCs w:val="28"/>
@@ -4458,8 +4395,6 @@
           </wp:inline>
         </w:drawing>
       </w:r>
-      <w:bookmarkStart w:id="4" w:name="_GoBack"/>
-      <w:bookmarkEnd w:id="4"/>
     </w:p>
     <w:p>
       <w:pPr>
@@ -4656,7 +4591,7 @@
           <w:color w:val="000000" w:themeColor="text1"/>
         </w:rPr>
       </w:pPr>
-      <w:bookmarkStart w:id="5" w:name="_Toc195102320"/>
+      <w:bookmarkStart w:id="4" w:name="_Toc195538314"/>
       <w:r>
         <w:rPr>
           <w:rFonts w:ascii="Times New Roman" w:hAnsi="Times New Roman" w:cs="Times New Roman"/>
@@ -4666,7 +4601,29 @@
         <w:lastRenderedPageBreak/>
         <w:t>Тема 5. Создание макета информационной системы</w:t>
       </w:r>
-      <w:bookmarkEnd w:id="5"/>
+      <w:bookmarkEnd w:id="4"/>
+    </w:p>
+    <w:p>
+      <w:r>
+        <w:rPr>
+          <w:rFonts w:ascii="Times New Roman" w:hAnsi="Times New Roman" w:cs="Times New Roman"/>
+          <w:sz w:val="28"/>
+          <w:szCs w:val="28"/>
+        </w:rPr>
+        <w:t>Ссылка на макет:</w:t>
+      </w:r>
+      <w:r>
+        <w:br/>
+      </w:r>
+      <w:hyperlink r:id="rId24" w:history="1">
+        <w:r>
+          <w:rPr>
+            <w:rStyle w:val="a7"/>
+            <w:color w:val="000000" w:themeColor="text1"/>
+          </w:rPr>
+          <w:t>https://www.figma.com/design/BIixSyRlRksNdhx5bIFVZA/У-меня-лапки--Соц.сеть-?node-id=0-1&amp;p=f&amp;t=3bsosLiRO05PlLVS-0</w:t>
+        </w:r>
+      </w:hyperlink>
     </w:p>
     <w:p>
       <w:pPr>
@@ -4740,7 +4697,7 @@
           <w:color w:val="000000" w:themeColor="text1"/>
         </w:rPr>
       </w:pPr>
-      <w:bookmarkStart w:id="6" w:name="_Toc195102321"/>
+      <w:bookmarkStart w:id="5" w:name="_Toc195538315"/>
       <w:r>
         <w:rPr>
           <w:rFonts w:ascii="Times New Roman" w:hAnsi="Times New Roman" w:cs="Times New Roman"/>
@@ -4750,40 +4707,310 @@
         <w:lastRenderedPageBreak/>
         <w:t>Тема 6.  Создание элементов пользовательского интерфейса</w:t>
       </w:r>
-      <w:bookmarkEnd w:id="6"/>
-    </w:p>
-    <w:p>
-      <w:pPr>
-        <w:pStyle w:val="1"/>
+      <w:bookmarkEnd w:id="5"/>
+    </w:p>
+    <w:p>
+      <w:pPr>
+        <w:spacing w:after="0" w:line="360" w:lineRule="auto"/>
         <w:ind w:firstLine="709"/>
-        <w:rPr>
-          <w:rFonts w:ascii="Times New Roman" w:hAnsi="Times New Roman" w:cs="Times New Roman"/>
-          <w:b/>
-          <w:color w:val="000000" w:themeColor="text1"/>
-        </w:rPr>
-      </w:pPr>
-    </w:p>
-    <w:p>
-      <w:pPr>
-        <w:pStyle w:val="1"/>
+        <w:jc w:val="both"/>
+        <w:rPr>
+          <w:rFonts w:ascii="Times New Roman" w:hAnsi="Times New Roman" w:cs="Times New Roman"/>
+          <w:color w:val="000000" w:themeColor="text1"/>
+          <w:sz w:val="28"/>
+          <w:szCs w:val="28"/>
+        </w:rPr>
+      </w:pPr>
+      <w:r>
+        <w:rPr>
+          <w:rFonts w:ascii="Times New Roman" w:hAnsi="Times New Roman" w:cs="Times New Roman"/>
+          <w:color w:val="000000" w:themeColor="text1"/>
+          <w:sz w:val="28"/>
+          <w:szCs w:val="28"/>
+        </w:rPr>
+        <w:t xml:space="preserve">Добавил кнопку «Обмануть» по нажатию которой </w:t>
+      </w:r>
+      <w:r>
+        <w:rPr>
+          <w:rFonts w:ascii="Times New Roman" w:hAnsi="Times New Roman" w:cs="Times New Roman"/>
+          <w:color w:val="000000" w:themeColor="text1"/>
+          <w:sz w:val="28"/>
+          <w:szCs w:val="28"/>
+        </w:rPr>
+        <w:t>перекидывает на страницу, где пользователь может подсмотреть правильный ответ на определенный вопрос</w:t>
+      </w:r>
+    </w:p>
+    <w:p>
+      <w:r>
+        <w:rPr>
+          <w:noProof/>
+        </w:rPr>
+        <w:drawing>
+          <wp:inline distT="0" distB="0" distL="0" distR="0" wp14:anchorId="3FD5CC8C" wp14:editId="3E829791">
+            <wp:extent cx="1976084" cy="3985260"/>
+            <wp:effectExtent l="0" t="0" r="5715" b="0"/>
+            <wp:docPr id="15202820" name="Рисунок 1"/>
+            <wp:cNvGraphicFramePr>
+              <a:graphicFrameLocks xmlns:a="http://schemas.openxmlformats.org/drawingml/2006/main" noChangeAspect="1"/>
+            </wp:cNvGraphicFramePr>
+            <a:graphic xmlns:a="http://schemas.openxmlformats.org/drawingml/2006/main">
+              <a:graphicData uri="http://schemas.openxmlformats.org/drawingml/2006/picture">
+                <pic:pic xmlns:pic="http://schemas.openxmlformats.org/drawingml/2006/picture">
+                  <pic:nvPicPr>
+                    <pic:cNvPr id="15202820" name=""/>
+                    <pic:cNvPicPr/>
+                  </pic:nvPicPr>
+                  <pic:blipFill>
+                    <a:blip r:embed="rId25"/>
+                    <a:stretch>
+                      <a:fillRect/>
+                    </a:stretch>
+                  </pic:blipFill>
+                  <pic:spPr>
+                    <a:xfrm>
+                      <a:off x="0" y="0"/>
+                      <a:ext cx="1999660" cy="4032807"/>
+                    </a:xfrm>
+                    <a:prstGeom prst="rect">
+                      <a:avLst/>
+                    </a:prstGeom>
+                  </pic:spPr>
+                </pic:pic>
+              </a:graphicData>
+            </a:graphic>
+          </wp:inline>
+        </w:drawing>
+      </w:r>
+    </w:p>
+    <w:p>
+      <w:pPr>
+        <w:suppressAutoHyphens w:val="0"/>
+      </w:pPr>
+      <w:r>
+        <w:br w:type="page"/>
+      </w:r>
+    </w:p>
+    <w:p>
+      <w:pPr>
+        <w:spacing w:after="0" w:line="360" w:lineRule="auto"/>
         <w:ind w:firstLine="709"/>
-        <w:rPr>
-          <w:rFonts w:ascii="Times New Roman" w:hAnsi="Times New Roman" w:cs="Times New Roman"/>
-          <w:b/>
-          <w:color w:val="000000" w:themeColor="text1"/>
-        </w:rPr>
-      </w:pPr>
-    </w:p>
-    <w:p>
-      <w:pPr>
-        <w:pStyle w:val="1"/>
+        <w:jc w:val="both"/>
+        <w:rPr>
+          <w:rFonts w:ascii="Times New Roman" w:hAnsi="Times New Roman" w:cs="Times New Roman"/>
+          <w:sz w:val="28"/>
+          <w:szCs w:val="28"/>
+          <w:lang w:val="en-US"/>
+        </w:rPr>
+      </w:pPr>
+      <w:r>
+        <w:rPr>
+          <w:rFonts w:ascii="Times New Roman" w:hAnsi="Times New Roman" w:cs="Times New Roman"/>
+          <w:sz w:val="28"/>
+          <w:szCs w:val="28"/>
+        </w:rPr>
+        <w:lastRenderedPageBreak/>
+        <w:t>Нажав</w:t>
+      </w:r>
+      <w:r>
+        <w:rPr>
+          <w:rFonts w:ascii="Times New Roman" w:hAnsi="Times New Roman" w:cs="Times New Roman"/>
+          <w:sz w:val="28"/>
+          <w:szCs w:val="28"/>
+        </w:rPr>
+        <w:t xml:space="preserve"> на кнопку «Показать ответ» покажется текст с правильным ответом</w:t>
+      </w:r>
+    </w:p>
+    <w:p>
+      <w:r>
+        <w:rPr>
+          <w:noProof/>
+        </w:rPr>
+        <w:drawing>
+          <wp:inline distT="0" distB="0" distL="0" distR="0" wp14:anchorId="43D8C0EC" wp14:editId="122B931C">
+            <wp:extent cx="1622170" cy="3314700"/>
+            <wp:effectExtent l="0" t="0" r="0" b="0"/>
+            <wp:docPr id="62195228" name="Рисунок 1"/>
+            <wp:cNvGraphicFramePr>
+              <a:graphicFrameLocks xmlns:a="http://schemas.openxmlformats.org/drawingml/2006/main" noChangeAspect="1"/>
+            </wp:cNvGraphicFramePr>
+            <a:graphic xmlns:a="http://schemas.openxmlformats.org/drawingml/2006/main">
+              <a:graphicData uri="http://schemas.openxmlformats.org/drawingml/2006/picture">
+                <pic:pic xmlns:pic="http://schemas.openxmlformats.org/drawingml/2006/picture">
+                  <pic:nvPicPr>
+                    <pic:cNvPr id="62195228" name=""/>
+                    <pic:cNvPicPr/>
+                  </pic:nvPicPr>
+                  <pic:blipFill>
+                    <a:blip r:embed="rId26"/>
+                    <a:stretch>
+                      <a:fillRect/>
+                    </a:stretch>
+                  </pic:blipFill>
+                  <pic:spPr>
+                    <a:xfrm>
+                      <a:off x="0" y="0"/>
+                      <a:ext cx="1644408" cy="3360141"/>
+                    </a:xfrm>
+                    <a:prstGeom prst="rect">
+                      <a:avLst/>
+                    </a:prstGeom>
+                  </pic:spPr>
+                </pic:pic>
+              </a:graphicData>
+            </a:graphic>
+          </wp:inline>
+        </w:drawing>
+      </w:r>
+    </w:p>
+    <w:p>
+      <w:pPr>
+        <w:spacing w:after="0" w:line="360" w:lineRule="auto"/>
         <w:ind w:firstLine="709"/>
-        <w:rPr>
-          <w:rFonts w:ascii="Times New Roman" w:hAnsi="Times New Roman" w:cs="Times New Roman"/>
-          <w:b/>
-          <w:color w:val="000000" w:themeColor="text1"/>
-        </w:rPr>
-      </w:pPr>
+        <w:jc w:val="both"/>
+        <w:rPr>
+          <w:rFonts w:ascii="Times New Roman" w:hAnsi="Times New Roman" w:cs="Times New Roman"/>
+          <w:sz w:val="28"/>
+          <w:szCs w:val="28"/>
+        </w:rPr>
+      </w:pPr>
+      <w:r>
+        <w:rPr>
+          <w:rFonts w:ascii="Times New Roman" w:hAnsi="Times New Roman" w:cs="Times New Roman"/>
+          <w:sz w:val="28"/>
+          <w:szCs w:val="28"/>
+        </w:rPr>
+        <w:t>И когда пользователь узнал правильный ответ, нажав на кнопку «Да» или на кнопк</w:t>
+      </w:r>
+      <w:r>
+        <w:rPr>
+          <w:rFonts w:ascii="Times New Roman" w:hAnsi="Times New Roman" w:cs="Times New Roman"/>
+          <w:sz w:val="28"/>
+          <w:szCs w:val="28"/>
+        </w:rPr>
+        <w:t>у</w:t>
+      </w:r>
+      <w:r>
+        <w:rPr>
+          <w:rFonts w:ascii="Times New Roman" w:hAnsi="Times New Roman" w:cs="Times New Roman"/>
+          <w:sz w:val="28"/>
+          <w:szCs w:val="28"/>
+        </w:rPr>
+        <w:t xml:space="preserve"> «Нет», то всплывёт уведомление «Обманывать нельзя»</w:t>
+      </w:r>
+    </w:p>
+    <w:p>
+      <w:r>
+        <w:rPr>
+          <w:noProof/>
+        </w:rPr>
+        <w:drawing>
+          <wp:inline distT="0" distB="0" distL="0" distR="0" wp14:anchorId="255F58A0" wp14:editId="06898491">
+            <wp:extent cx="1629877" cy="3329940"/>
+            <wp:effectExtent l="0" t="0" r="8890" b="3810"/>
+            <wp:docPr id="1224352421" name="Рисунок 1"/>
+            <wp:cNvGraphicFramePr>
+              <a:graphicFrameLocks xmlns:a="http://schemas.openxmlformats.org/drawingml/2006/main" noChangeAspect="1"/>
+            </wp:cNvGraphicFramePr>
+            <a:graphic xmlns:a="http://schemas.openxmlformats.org/drawingml/2006/main">
+              <a:graphicData uri="http://schemas.openxmlformats.org/drawingml/2006/picture">
+                <pic:pic xmlns:pic="http://schemas.openxmlformats.org/drawingml/2006/picture">
+                  <pic:nvPicPr>
+                    <pic:cNvPr id="1224352421" name=""/>
+                    <pic:cNvPicPr/>
+                  </pic:nvPicPr>
+                  <pic:blipFill>
+                    <a:blip r:embed="rId27"/>
+                    <a:stretch>
+                      <a:fillRect/>
+                    </a:stretch>
+                  </pic:blipFill>
+                  <pic:spPr>
+                    <a:xfrm>
+                      <a:off x="0" y="0"/>
+                      <a:ext cx="1639080" cy="3348742"/>
+                    </a:xfrm>
+                    <a:prstGeom prst="rect">
+                      <a:avLst/>
+                    </a:prstGeom>
+                  </pic:spPr>
+                </pic:pic>
+              </a:graphicData>
+            </a:graphic>
+          </wp:inline>
+        </w:drawing>
+      </w:r>
+    </w:p>
+    <w:p/>
+    <w:p>
+      <w:pPr>
+        <w:suppressAutoHyphens w:val="0"/>
+      </w:pPr>
+      <w:r>
+        <w:br w:type="page"/>
+      </w:r>
+    </w:p>
+    <w:p>
+      <w:pPr>
+        <w:spacing w:after="0" w:line="360" w:lineRule="auto"/>
+        <w:ind w:firstLine="709"/>
+        <w:jc w:val="both"/>
+        <w:rPr>
+          <w:rFonts w:ascii="Times New Roman" w:hAnsi="Times New Roman" w:cs="Times New Roman"/>
+          <w:sz w:val="28"/>
+          <w:szCs w:val="28"/>
+        </w:rPr>
+      </w:pPr>
+      <w:r>
+        <w:rPr>
+          <w:rFonts w:ascii="Times New Roman" w:hAnsi="Times New Roman" w:cs="Times New Roman"/>
+          <w:sz w:val="28"/>
+          <w:szCs w:val="28"/>
+        </w:rPr>
+        <w:lastRenderedPageBreak/>
+        <w:t>Пользователь нажимает на кнопку «Далее» пока не появится вопрос, ответ на который был подсмотрен, снова не появится на экране</w:t>
+      </w:r>
+    </w:p>
+    <w:p>
+      <w:r>
+        <w:rPr>
+          <w:noProof/>
+        </w:rPr>
+        <w:drawing>
+          <wp:inline distT="0" distB="0" distL="0" distR="0" wp14:anchorId="1A8A6490" wp14:editId="42709B8D">
+            <wp:extent cx="1772242" cy="3665220"/>
+            <wp:effectExtent l="0" t="0" r="0" b="0"/>
+            <wp:docPr id="57761827" name="Рисунок 1"/>
+            <wp:cNvGraphicFramePr>
+              <a:graphicFrameLocks xmlns:a="http://schemas.openxmlformats.org/drawingml/2006/main" noChangeAspect="1"/>
+            </wp:cNvGraphicFramePr>
+            <a:graphic xmlns:a="http://schemas.openxmlformats.org/drawingml/2006/main">
+              <a:graphicData uri="http://schemas.openxmlformats.org/drawingml/2006/picture">
+                <pic:pic xmlns:pic="http://schemas.openxmlformats.org/drawingml/2006/picture">
+                  <pic:nvPicPr>
+                    <pic:cNvPr id="57761827" name=""/>
+                    <pic:cNvPicPr/>
+                  </pic:nvPicPr>
+                  <pic:blipFill>
+                    <a:blip r:embed="rId28"/>
+                    <a:stretch>
+                      <a:fillRect/>
+                    </a:stretch>
+                  </pic:blipFill>
+                  <pic:spPr>
+                    <a:xfrm>
+                      <a:off x="0" y="0"/>
+                      <a:ext cx="1777381" cy="3675848"/>
+                    </a:xfrm>
+                    <a:prstGeom prst="rect">
+                      <a:avLst/>
+                    </a:prstGeom>
+                  </pic:spPr>
+                </pic:pic>
+              </a:graphicData>
+            </a:graphic>
+          </wp:inline>
+        </w:drawing>
+      </w:r>
     </w:p>
     <w:p>
       <w:pPr>
@@ -4824,7 +5051,7 @@
           <w:color w:val="000000" w:themeColor="text1"/>
         </w:rPr>
       </w:pPr>
-      <w:bookmarkStart w:id="7" w:name="_Toc195102322"/>
+      <w:bookmarkStart w:id="6" w:name="_Toc195538316"/>
       <w:r>
         <w:rPr>
           <w:rFonts w:ascii="Times New Roman" w:hAnsi="Times New Roman" w:cs="Times New Roman"/>
@@ -4864,13 +5091,266 @@
         </w:rPr>
         <w:t>Design</w:t>
       </w:r>
+      <w:bookmarkEnd w:id="6"/>
+      <w:proofErr w:type="spellEnd"/>
+    </w:p>
+    <w:p>
+      <w:pPr>
+        <w:spacing w:after="0" w:line="360" w:lineRule="auto"/>
+        <w:ind w:firstLine="709"/>
+        <w:jc w:val="both"/>
+        <w:rPr>
+          <w:rFonts w:ascii="Times New Roman" w:hAnsi="Times New Roman" w:cs="Times New Roman"/>
+          <w:bCs/>
+          <w:color w:val="000000" w:themeColor="text1"/>
+          <w:sz w:val="28"/>
+          <w:szCs w:val="28"/>
+          <w:shd w:val="clear" w:color="auto" w:fill="FFFFFF"/>
+        </w:rPr>
+      </w:pPr>
+      <w:r>
+        <w:rPr>
+          <w:rFonts w:ascii="Times New Roman" w:hAnsi="Times New Roman" w:cs="Times New Roman"/>
+          <w:bCs/>
+          <w:color w:val="000000" w:themeColor="text1"/>
+          <w:sz w:val="28"/>
+          <w:szCs w:val="28"/>
+          <w:shd w:val="clear" w:color="auto" w:fill="FFFFFF"/>
+        </w:rPr>
+        <w:t>Создание нового проекта</w:t>
+      </w:r>
+    </w:p>
+    <w:p>
+      <w:pPr>
+        <w:rPr>
+          <w:rFonts w:ascii="Times New Roman" w:hAnsi="Times New Roman" w:cs="Times New Roman"/>
+          <w:b/>
+          <w:color w:val="000000" w:themeColor="text1"/>
+          <w:shd w:val="clear" w:color="auto" w:fill="FFFFFF"/>
+        </w:rPr>
+      </w:pPr>
+      <w:r>
+        <w:rPr>
+          <w:noProof/>
+        </w:rPr>
+        <w:drawing>
+          <wp:inline distT="0" distB="0" distL="0" distR="0" wp14:anchorId="3C1281A8" wp14:editId="249DB278">
+            <wp:extent cx="3733800" cy="2684750"/>
+            <wp:effectExtent l="0" t="0" r="0" b="1905"/>
+            <wp:docPr id="1542284042" name="Рисунок 1"/>
+            <wp:cNvGraphicFramePr>
+              <a:graphicFrameLocks xmlns:a="http://schemas.openxmlformats.org/drawingml/2006/main" noChangeAspect="1"/>
+            </wp:cNvGraphicFramePr>
+            <a:graphic xmlns:a="http://schemas.openxmlformats.org/drawingml/2006/main">
+              <a:graphicData uri="http://schemas.openxmlformats.org/drawingml/2006/picture">
+                <pic:pic xmlns:pic="http://schemas.openxmlformats.org/drawingml/2006/picture">
+                  <pic:nvPicPr>
+                    <pic:cNvPr id="1542284042" name=""/>
+                    <pic:cNvPicPr/>
+                  </pic:nvPicPr>
+                  <pic:blipFill>
+                    <a:blip r:embed="rId29"/>
+                    <a:stretch>
+                      <a:fillRect/>
+                    </a:stretch>
+                  </pic:blipFill>
+                  <pic:spPr>
+                    <a:xfrm>
+                      <a:off x="0" y="0"/>
+                      <a:ext cx="3746098" cy="2693593"/>
+                    </a:xfrm>
+                    <a:prstGeom prst="rect">
+                      <a:avLst/>
+                    </a:prstGeom>
+                  </pic:spPr>
+                </pic:pic>
+              </a:graphicData>
+            </a:graphic>
+          </wp:inline>
+        </w:drawing>
+      </w:r>
+    </w:p>
+    <w:p>
+      <w:pPr>
+        <w:spacing w:after="0" w:line="360" w:lineRule="auto"/>
+        <w:ind w:firstLine="709"/>
+        <w:jc w:val="both"/>
+        <w:rPr>
+          <w:rFonts w:ascii="Times New Roman" w:hAnsi="Times New Roman" w:cs="Times New Roman"/>
+          <w:color w:val="000000" w:themeColor="text1"/>
+          <w:shd w:val="clear" w:color="auto" w:fill="FFFFFF"/>
+        </w:rPr>
+      </w:pPr>
+      <w:r>
+        <w:rPr>
+          <w:rFonts w:ascii="Times New Roman" w:hAnsi="Times New Roman" w:cs="Times New Roman"/>
+          <w:color w:val="000000" w:themeColor="text1"/>
+          <w:sz w:val="28"/>
+          <w:szCs w:val="28"/>
+          <w:shd w:val="clear" w:color="auto" w:fill="FFFFFF"/>
+        </w:rPr>
+        <w:t>Здесь представлена форма для ввода названия книги</w:t>
+      </w:r>
+    </w:p>
+    <w:p>
+      <w:pPr>
+        <w:rPr>
+          <w:rFonts w:ascii="Times New Roman" w:hAnsi="Times New Roman" w:cs="Times New Roman"/>
+          <w:color w:val="000000" w:themeColor="text1"/>
+          <w:shd w:val="clear" w:color="auto" w:fill="FFFFFF"/>
+        </w:rPr>
+      </w:pPr>
+      <w:r>
+        <w:rPr>
+          <w:rFonts w:ascii="Times New Roman" w:hAnsi="Times New Roman" w:cs="Times New Roman"/>
+          <w:color w:val="000000" w:themeColor="text1"/>
+          <w:shd w:val="clear" w:color="auto" w:fill="FFFFFF"/>
+        </w:rPr>
+        <w:drawing>
+          <wp:inline distT="0" distB="0" distL="0" distR="0" wp14:anchorId="122ADE2D" wp14:editId="2910C42F">
+            <wp:extent cx="1923803" cy="4086576"/>
+            <wp:effectExtent l="0" t="0" r="635" b="0"/>
+            <wp:docPr id="11" name="Рисунок 11"/>
+            <wp:cNvGraphicFramePr>
+              <a:graphicFrameLocks xmlns:a="http://schemas.openxmlformats.org/drawingml/2006/main" noChangeAspect="1"/>
+            </wp:cNvGraphicFramePr>
+            <a:graphic xmlns:a="http://schemas.openxmlformats.org/drawingml/2006/main">
+              <a:graphicData uri="http://schemas.openxmlformats.org/drawingml/2006/picture">
+                <pic:pic xmlns:pic="http://schemas.openxmlformats.org/drawingml/2006/picture">
+                  <pic:nvPicPr>
+                    <pic:cNvPr id="1" name=""/>
+                    <pic:cNvPicPr/>
+                  </pic:nvPicPr>
+                  <pic:blipFill>
+                    <a:blip r:embed="rId30"/>
+                    <a:stretch>
+                      <a:fillRect/>
+                    </a:stretch>
+                  </pic:blipFill>
+                  <pic:spPr>
+                    <a:xfrm>
+                      <a:off x="0" y="0"/>
+                      <a:ext cx="1958656" cy="4160611"/>
+                    </a:xfrm>
+                    <a:prstGeom prst="rect">
+                      <a:avLst/>
+                    </a:prstGeom>
+                  </pic:spPr>
+                </pic:pic>
+              </a:graphicData>
+            </a:graphic>
+          </wp:inline>
+        </w:drawing>
+      </w:r>
+    </w:p>
+    <w:p>
+      <w:pPr>
+        <w:suppressAutoHyphens w:val="0"/>
+        <w:rPr>
+          <w:rFonts w:ascii="Times New Roman" w:hAnsi="Times New Roman" w:cs="Times New Roman"/>
+          <w:color w:val="000000" w:themeColor="text1"/>
+          <w:shd w:val="clear" w:color="auto" w:fill="FFFFFF"/>
+        </w:rPr>
+      </w:pPr>
+      <w:r>
+        <w:rPr>
+          <w:rFonts w:ascii="Times New Roman" w:hAnsi="Times New Roman" w:cs="Times New Roman"/>
+          <w:color w:val="000000" w:themeColor="text1"/>
+          <w:shd w:val="clear" w:color="auto" w:fill="FFFFFF"/>
+        </w:rPr>
+        <w:br w:type="page"/>
+      </w:r>
+    </w:p>
+    <w:p>
+      <w:pPr>
+        <w:spacing w:after="0" w:line="360" w:lineRule="auto"/>
+        <w:ind w:firstLine="709"/>
+        <w:jc w:val="both"/>
+        <w:rPr>
+          <w:rFonts w:ascii="Times New Roman" w:hAnsi="Times New Roman" w:cs="Times New Roman"/>
+          <w:color w:val="000000" w:themeColor="text1"/>
+          <w:sz w:val="28"/>
+          <w:szCs w:val="28"/>
+          <w:shd w:val="clear" w:color="auto" w:fill="FFFFFF"/>
+        </w:rPr>
+      </w:pPr>
+      <w:r>
+        <w:rPr>
+          <w:rFonts w:ascii="Times New Roman" w:hAnsi="Times New Roman" w:cs="Times New Roman"/>
+          <w:color w:val="000000" w:themeColor="text1"/>
+          <w:sz w:val="28"/>
+          <w:szCs w:val="28"/>
+          <w:shd w:val="clear" w:color="auto" w:fill="FFFFFF"/>
+        </w:rPr>
+        <w:lastRenderedPageBreak/>
+        <w:t xml:space="preserve">Для примера введу </w:t>
+      </w:r>
+      <w:bookmarkStart w:id="7" w:name="_GoBack"/>
       <w:bookmarkEnd w:id="7"/>
-      <w:proofErr w:type="spellEnd"/>
-    </w:p>
-    <w:p>
-      <w:pPr>
-        <w:pStyle w:val="1"/>
-        <w:ind w:firstLine="709"/>
+      <w:r>
+        <w:rPr>
+          <w:rFonts w:ascii="Times New Roman" w:hAnsi="Times New Roman" w:cs="Times New Roman"/>
+          <w:color w:val="000000" w:themeColor="text1"/>
+          <w:sz w:val="28"/>
+          <w:szCs w:val="28"/>
+          <w:shd w:val="clear" w:color="auto" w:fill="FFFFFF"/>
+        </w:rPr>
+        <w:t>что-нибудь</w:t>
+      </w:r>
+    </w:p>
+    <w:p>
+      <w:pPr>
+        <w:rPr>
+          <w:rFonts w:ascii="Times New Roman" w:hAnsi="Times New Roman" w:cs="Times New Roman"/>
+          <w:color w:val="000000" w:themeColor="text1"/>
+          <w:shd w:val="clear" w:color="auto" w:fill="FFFFFF"/>
+        </w:rPr>
+      </w:pPr>
+      <w:r>
+        <w:rPr>
+          <w:rFonts w:ascii="Times New Roman" w:hAnsi="Times New Roman" w:cs="Times New Roman"/>
+          <w:color w:val="000000" w:themeColor="text1"/>
+          <w:shd w:val="clear" w:color="auto" w:fill="FFFFFF"/>
+        </w:rPr>
+        <w:drawing>
+          <wp:inline distT="0" distB="0" distL="0" distR="0" wp14:anchorId="0A08F37D" wp14:editId="546B8D5E">
+            <wp:extent cx="1911927" cy="4076800"/>
+            <wp:effectExtent l="0" t="0" r="0" b="0"/>
+            <wp:docPr id="12" name="Рисунок 12"/>
+            <wp:cNvGraphicFramePr>
+              <a:graphicFrameLocks xmlns:a="http://schemas.openxmlformats.org/drawingml/2006/main" noChangeAspect="1"/>
+            </wp:cNvGraphicFramePr>
+            <a:graphic xmlns:a="http://schemas.openxmlformats.org/drawingml/2006/main">
+              <a:graphicData uri="http://schemas.openxmlformats.org/drawingml/2006/picture">
+                <pic:pic xmlns:pic="http://schemas.openxmlformats.org/drawingml/2006/picture">
+                  <pic:nvPicPr>
+                    <pic:cNvPr id="1" name=""/>
+                    <pic:cNvPicPr/>
+                  </pic:nvPicPr>
+                  <pic:blipFill>
+                    <a:blip r:embed="rId31"/>
+                    <a:stretch>
+                      <a:fillRect/>
+                    </a:stretch>
+                  </pic:blipFill>
+                  <pic:spPr>
+                    <a:xfrm>
+                      <a:off x="0" y="0"/>
+                      <a:ext cx="1920399" cy="4094864"/>
+                    </a:xfrm>
+                    <a:prstGeom prst="rect">
+                      <a:avLst/>
+                    </a:prstGeom>
+                  </pic:spPr>
+                </pic:pic>
+              </a:graphicData>
+            </a:graphic>
+          </wp:inline>
+        </w:drawing>
+      </w:r>
+    </w:p>
+    <w:p>
+      <w:pPr>
         <w:rPr>
           <w:rFonts w:ascii="Times New Roman" w:hAnsi="Times New Roman" w:cs="Times New Roman"/>
           <w:b/>
@@ -4944,7 +5424,7 @@
           <w:color w:val="000000" w:themeColor="text1"/>
         </w:rPr>
       </w:pPr>
-      <w:bookmarkStart w:id="8" w:name="_Toc195102323"/>
+      <w:bookmarkStart w:id="8" w:name="_Toc195538317"/>
       <w:r>
         <w:rPr>
           <w:rFonts w:ascii="Times New Roman" w:hAnsi="Times New Roman" w:cs="Times New Roman"/>
@@ -5028,7 +5508,7 @@
           <w:color w:val="000000" w:themeColor="text1"/>
         </w:rPr>
       </w:pPr>
-      <w:bookmarkStart w:id="9" w:name="_Toc195102324"/>
+      <w:bookmarkStart w:id="9" w:name="_Toc195538318"/>
       <w:r>
         <w:rPr>
           <w:rFonts w:ascii="Times New Roman" w:hAnsi="Times New Roman" w:cs="Times New Roman"/>
@@ -5123,7 +5603,7 @@
           <w:color w:val="000000" w:themeColor="text1"/>
         </w:rPr>
       </w:pPr>
-      <w:bookmarkStart w:id="10" w:name="_Toc195102325"/>
+      <w:bookmarkStart w:id="10" w:name="_Toc195538319"/>
       <w:r>
         <w:rPr>
           <w:rFonts w:ascii="Times New Roman" w:hAnsi="Times New Roman" w:cs="Times New Roman"/>
@@ -5207,7 +5687,7 @@
           <w:color w:val="000000" w:themeColor="text1"/>
         </w:rPr>
       </w:pPr>
-      <w:bookmarkStart w:id="11" w:name="_Toc195102326"/>
+      <w:bookmarkStart w:id="11" w:name="_Toc195538320"/>
       <w:r>
         <w:rPr>
           <w:rFonts w:ascii="Times New Roman" w:hAnsi="Times New Roman" w:cs="Times New Roman"/>
@@ -5302,7 +5782,7 @@
           <w:color w:val="000000" w:themeColor="text1"/>
         </w:rPr>
       </w:pPr>
-      <w:bookmarkStart w:id="12" w:name="_Toc195102327"/>
+      <w:bookmarkStart w:id="12" w:name="_Toc195538321"/>
       <w:r>
         <w:rPr>
           <w:rFonts w:ascii="Times New Roman" w:hAnsi="Times New Roman" w:cs="Times New Roman"/>
@@ -5399,7 +5879,7 @@
           <w:color w:val="000000" w:themeColor="text1"/>
         </w:rPr>
       </w:pPr>
-      <w:bookmarkStart w:id="13" w:name="_Toc195102328"/>
+      <w:bookmarkStart w:id="13" w:name="_Toc195538322"/>
       <w:r>
         <w:rPr>
           <w:rFonts w:ascii="Times New Roman" w:hAnsi="Times New Roman" w:cs="Times New Roman"/>
@@ -5480,7 +5960,7 @@
           <w:color w:val="000000" w:themeColor="text1"/>
         </w:rPr>
       </w:pPr>
-      <w:bookmarkStart w:id="14" w:name="_Toc195102329"/>
+      <w:bookmarkStart w:id="14" w:name="_Toc195538323"/>
       <w:r>
         <w:rPr>
           <w:rFonts w:ascii="Times New Roman" w:hAnsi="Times New Roman" w:cs="Times New Roman"/>
@@ -5564,7 +6044,7 @@
           <w:color w:val="000000" w:themeColor="text1"/>
         </w:rPr>
       </w:pPr>
-      <w:bookmarkStart w:id="15" w:name="_Toc195102330"/>
+      <w:bookmarkStart w:id="15" w:name="_Toc195538324"/>
       <w:r>
         <w:rPr>
           <w:rFonts w:ascii="Times New Roman" w:hAnsi="Times New Roman" w:cs="Times New Roman"/>
@@ -5637,7 +6117,7 @@
           <w:color w:val="000000" w:themeColor="text1"/>
         </w:rPr>
       </w:pPr>
-      <w:bookmarkStart w:id="16" w:name="_Toc195102331"/>
+      <w:bookmarkStart w:id="16" w:name="_Toc195538325"/>
       <w:r>
         <w:rPr>
           <w:rFonts w:ascii="Times New Roman" w:hAnsi="Times New Roman" w:cs="Times New Roman"/>
@@ -5676,7 +6156,7 @@
       </w:pPr>
     </w:p>
     <w:sectPr>
-      <w:footerReference w:type="default" r:id="rId24"/>
+      <w:footerReference w:type="default" r:id="rId32"/>
       <w:pgSz w:w="11906" w:h="16838"/>
       <w:pgMar w:top="1134" w:right="850" w:bottom="1134" w:left="1701" w:header="708" w:footer="708" w:gutter="0"/>
       <w:cols w:space="708"/>
@@ -7400,6 +7880,30 @@
       <w:szCs w:val="20"/>
     </w:rPr>
   </w:style>
+  <w:style w:type="character" w:styleId="af">
+    <w:name w:val="Unresolved Mention"/>
+    <w:basedOn w:val="a0"/>
+    <w:uiPriority w:val="99"/>
+    <w:semiHidden/>
+    <w:unhideWhenUsed/>
+    <w:rsid w:val="00991E10"/>
+    <w:rPr>
+      <w:color w:val="605E5C"/>
+      <w:shd w:val="clear" w:color="auto" w:fill="E1DFDD"/>
+    </w:rPr>
+  </w:style>
+  <w:style w:type="character" w:styleId="af0">
+    <w:name w:val="FollowedHyperlink"/>
+    <w:basedOn w:val="a0"/>
+    <w:uiPriority w:val="99"/>
+    <w:semiHidden/>
+    <w:unhideWhenUsed/>
+    <w:rsid w:val="00991E10"/>
+    <w:rPr>
+      <w:color w:val="954F72" w:themeColor="followedHyperlink"/>
+      <w:u w:val="single"/>
+    </w:rPr>
+  </w:style>
 </w:styles>
 </file>
 
@@ -7703,7 +8207,7 @@
 </file>
 
 <file path=customXml/itemProps1.xml><?xml version="1.0" encoding="utf-8"?>
-<ds:datastoreItem xmlns:ds="http://schemas.openxmlformats.org/officeDocument/2006/customXml" ds:itemID="{C965A4B6-2B12-4605-B69D-FA949F6C01CB}">
+<ds:datastoreItem xmlns:ds="http://schemas.openxmlformats.org/officeDocument/2006/customXml" ds:itemID="{7AEBC5B4-BA2C-4E69-A608-90689BE7AD5E}">
   <ds:schemaRefs>
     <ds:schemaRef ds:uri="http://schemas.openxmlformats.org/officeDocument/2006/bibliography"/>
   </ds:schemaRefs>

</xml_diff>